<commit_message>
Manage imported data (view/restore/clear/delete, 30-day undo); compact policy format OFF by default; failed-batch → review tests; AI-agree label fix
</commit_message>
<xml_diff>
--- a/backend/tests/fixtures/policies/ra_policy_raven_trap_xx1.docx
+++ b/backend/tests/fixtures/policies/ra_policy_raven_trap_xx1.docx
@@ -194,7 +194,7 @@
           </w:tcPr>
           <w:p>
             <w:r>
-              <w:t>Policy owner</w:t>
+              <w:t>Role</w:t>
             </w:r>
           </w:p>
         </w:tc>
@@ -1169,17 +1169,17 @@
           </w:tcPr>
           <w:p>
             <w:r>
-              <w:t>ISSM (policy owner)</w:t>
-            </w:r>
-          </w:p>
-        </w:tc>
-        <w:tc>
-          <w:tcPr>
-            <w:tcW w:w="4680" w:type="dxa"/>
-          </w:tcPr>
-          <w:p>
-            <w:r>
-              <w:t>Maintains this policy and procedures. Oversees risk assessments, vulnerability management, and reporting in eMASS.</w:t>
+              <w:t>ISSM</w:t>
+            </w:r>
+          </w:p>
+        </w:tc>
+        <w:tc>
+          <w:tcPr>
+            <w:tcW w:w="4680" w:type="dxa"/>
+          </w:tcPr>
+          <w:p>
+            <w:r>
+              <w:t>Oversees risk assessments, vulnerability management, and reporting in eMASS.</w:t>
             </w:r>
           </w:p>
         </w:tc>
@@ -1418,13 +1418,12 @@
         </w:numPr>
       </w:pPr>
       <w:r>
-        <w:t xml:space="preserve">The ISSM shall develop and maintain this system-level risk assessment policy, covering purpose, scope, roles, responsibilities, management commitment, coordination, and compliance. </w:t>
+        <w:t>This system-level risk assessment policy covers purpose, scope, roles, responsibilities, management commitment, coordination, and compliance. (RA-1a.1)</w:t>
       </w:r>
       <w:r>
         <w:rPr>
           <w:i/>
         </w:rPr>
-        <w:t>(RA-1a.1)</w:t>
       </w:r>
     </w:p>
     <w:p>
@@ -1436,13 +1435,12 @@
         </w:numPr>
       </w:pPr>
       <w:r>
-        <w:t xml:space="preserve">The ISSM shall develop and maintain procedures that implement this policy and the RA controls. At minimum: a categorization procedure, a risk assessment procedure, a vulnerability management standard operating procedure, and a POA&amp;M management procedure. </w:t>
+        <w:t>Procedures implement this policy and the RA controls. At minimum: a categorization procedure, a risk assessment procedure, a vulnerability management standard operating procedure, and a POA&amp;M management procedure. (RA-1a.2)</w:t>
       </w:r>
       <w:r>
         <w:rPr>
           <w:i/>
         </w:rPr>
-        <w:t>(RA-1a.2)</w:t>
       </w:r>
     </w:p>
     <w:p>
@@ -6491,7 +6489,7 @@
           </w:tcPr>
           <w:p>
             <w:r>
-              <w:t>ISSM (policy owner)</w:t>
+              <w:t>ISSM</w:t>
             </w:r>
           </w:p>
         </w:tc>

</xml_diff>